<commit_message>
added readme and refreshed reports
</commit_message>
<xml_diff>
--- a/docs/Федоров Лаб1.docx
+++ b/docs/Федоров Лаб1.docx
@@ -19,101 +19,97 @@
           <w:sz w:val="28"/>
           <w:szCs w:val="28"/>
         </w:rPr>
-        <w:t>Министерство науки и высшего образования Российской Федерации</w:t>
-      </w:r>
-    </w:p>
-    <w:p>
-      <w:pPr>
-        <w:pStyle w:val="p1"/>
-        <w:adjustRightInd w:val="0"/>
-        <w:snapToGrid w:val="0"/>
-        <w:spacing w:after="160" w:line="259" w:lineRule="auto"/>
-        <w:jc w:val="center"/>
+        <w:t>Ф</w:t>
+      </w:r>
+      <w:r>
         <w:rPr>
           <w:sz w:val="28"/>
           <w:szCs w:val="28"/>
         </w:rPr>
-      </w:pPr>
-      <w:r>
+        <w:t xml:space="preserve">едеральное государственное автономное </w:t>
+      </w:r>
+    </w:p>
+    <w:p>
+      <w:pPr>
+        <w:pStyle w:val="p1"/>
+        <w:adjustRightInd w:val="0"/>
+        <w:snapToGrid w:val="0"/>
+        <w:spacing w:after="160" w:line="259" w:lineRule="auto"/>
+        <w:jc w:val="center"/>
         <w:rPr>
           <w:sz w:val="28"/>
           <w:szCs w:val="28"/>
         </w:rPr>
-        <w:t>федеральное государственное автономное образовательное учреждение</w:t>
-      </w:r>
-    </w:p>
-    <w:p>
-      <w:pPr>
-        <w:pStyle w:val="p1"/>
-        <w:adjustRightInd w:val="0"/>
-        <w:snapToGrid w:val="0"/>
-        <w:spacing w:after="160" w:line="259" w:lineRule="auto"/>
-        <w:jc w:val="center"/>
+      </w:pPr>
+      <w:r>
         <w:rPr>
           <w:sz w:val="28"/>
           <w:szCs w:val="28"/>
         </w:rPr>
-      </w:pPr>
+        <w:t>образовательное учреждение</w:t>
+      </w:r>
       <w:r>
         <w:rPr>
           <w:sz w:val="28"/>
           <w:szCs w:val="28"/>
         </w:rPr>
-        <w:t>высшего образования «Национальный исследовательский университет</w:t>
-      </w:r>
-    </w:p>
-    <w:p>
-      <w:pPr>
-        <w:pStyle w:val="p1"/>
-        <w:adjustRightInd w:val="0"/>
-        <w:snapToGrid w:val="0"/>
-        <w:spacing w:after="160" w:line="259" w:lineRule="auto"/>
-        <w:jc w:val="center"/>
+        <w:t xml:space="preserve"> </w:t>
+      </w:r>
+      <w:r>
         <w:rPr>
           <w:sz w:val="28"/>
           <w:szCs w:val="28"/>
         </w:rPr>
-      </w:pPr>
-      <w:r>
+        <w:t xml:space="preserve">высшего образования </w:t>
+      </w:r>
+    </w:p>
+    <w:p>
+      <w:pPr>
+        <w:pStyle w:val="p1"/>
+        <w:adjustRightInd w:val="0"/>
+        <w:snapToGrid w:val="0"/>
+        <w:spacing w:after="160" w:line="259" w:lineRule="auto"/>
+        <w:jc w:val="center"/>
         <w:rPr>
           <w:sz w:val="28"/>
           <w:szCs w:val="28"/>
         </w:rPr>
-        <w:t>ИТМО»</w:t>
-      </w:r>
-    </w:p>
-    <w:p>
-      <w:pPr>
-        <w:pStyle w:val="p1"/>
-        <w:adjustRightInd w:val="0"/>
-        <w:snapToGrid w:val="0"/>
-        <w:spacing w:after="160" w:line="259" w:lineRule="auto"/>
-        <w:jc w:val="both"/>
+      </w:pPr>
+      <w:r>
         <w:rPr>
           <w:sz w:val="28"/>
           <w:szCs w:val="28"/>
         </w:rPr>
-      </w:pPr>
-    </w:p>
-    <w:p>
-      <w:pPr>
-        <w:pStyle w:val="p1"/>
-        <w:adjustRightInd w:val="0"/>
-        <w:snapToGrid w:val="0"/>
-        <w:spacing w:after="160" w:line="259" w:lineRule="auto"/>
-        <w:jc w:val="center"/>
+        <w:t>«Национальный исследовательский университет</w:t>
+      </w:r>
+      <w:r>
         <w:rPr>
           <w:sz w:val="28"/>
           <w:szCs w:val="28"/>
-        </w:rPr>
-      </w:pPr>
+          <w:lang w:val="en-US"/>
+        </w:rPr>
+        <w:t xml:space="preserve"> </w:t>
+      </w:r>
       <w:r>
         <w:rPr>
           <w:sz w:val="28"/>
           <w:szCs w:val="28"/>
         </w:rPr>
-        <w:t>Факультет программной инженерии и компьютерной техники</w:t>
-      </w:r>
+        <w:t>ИТМО»</w:t>
+      </w:r>
+    </w:p>
+    <w:p>
+      <w:pPr>
+        <w:pStyle w:val="p1"/>
+        <w:adjustRightInd w:val="0"/>
+        <w:snapToGrid w:val="0"/>
+        <w:spacing w:after="160" w:line="259" w:lineRule="auto"/>
+        <w:jc w:val="both"/>
+        <w:rPr>
+          <w:sz w:val="28"/>
+          <w:szCs w:val="28"/>
+        </w:rPr>
+      </w:pPr>
     </w:p>
     <w:p>
       <w:pPr>
@@ -147,18 +143,25 @@
     </w:p>
     <w:p>
       <w:pPr>
-        <w:pStyle w:val="p1"/>
-        <w:adjustRightInd w:val="0"/>
-        <w:snapToGrid w:val="0"/>
-        <w:spacing w:after="160" w:line="259" w:lineRule="auto"/>
-        <w:jc w:val="both"/>
+        <w:pStyle w:val="p2"/>
+        <w:adjustRightInd w:val="0"/>
+        <w:snapToGrid w:val="0"/>
+        <w:spacing w:after="160" w:line="259" w:lineRule="auto"/>
+        <w:jc w:val="center"/>
+        <w:rPr>
+          <w:sz w:val="28"/>
+          <w:szCs w:val="28"/>
+        </w:rPr>
+      </w:pPr>
+      <w:r>
         <w:rPr>
           <w:b/>
           <w:bCs/>
           <w:sz w:val="28"/>
           <w:szCs w:val="28"/>
         </w:rPr>
-      </w:pPr>
+        <w:t>Информационная безопасность</w:t>
+      </w:r>
     </w:p>
     <w:p>
       <w:pPr>
@@ -181,12 +184,12 @@
           <w:sz w:val="28"/>
           <w:szCs w:val="28"/>
         </w:rPr>
-        <w:t>Лабораторная работа №1 по предмету</w:t>
-      </w:r>
-    </w:p>
-    <w:p>
-      <w:pPr>
-        <w:pStyle w:val="p2"/>
+        <w:t xml:space="preserve">Лабораторная работа №1 </w:t>
+      </w:r>
+    </w:p>
+    <w:p>
+      <w:pPr>
+        <w:pStyle w:val="p1"/>
         <w:adjustRightInd w:val="0"/>
         <w:snapToGrid w:val="0"/>
         <w:spacing w:after="160" w:line="259" w:lineRule="auto"/>
@@ -203,7 +206,7 @@
           <w:sz w:val="28"/>
           <w:szCs w:val="28"/>
         </w:rPr>
-        <w:t>"Информационная безопасность"</w:t>
+        <w:t>"Разработка защищенного REST API с интеграцией в CI/CD"</w:t>
       </w:r>
     </w:p>
     <w:p>
@@ -212,21 +215,25 @@
         <w:adjustRightInd w:val="0"/>
         <w:snapToGrid w:val="0"/>
         <w:spacing w:after="160" w:line="259" w:lineRule="auto"/>
-        <w:jc w:val="center"/>
+        <w:jc w:val="both"/>
         <w:rPr>
           <w:sz w:val="28"/>
           <w:szCs w:val="28"/>
         </w:rPr>
       </w:pPr>
-      <w:r>
-        <w:rPr>
-          <w:b/>
-          <w:bCs/>
+    </w:p>
+    <w:p>
+      <w:pPr>
+        <w:pStyle w:val="p1"/>
+        <w:adjustRightInd w:val="0"/>
+        <w:snapToGrid w:val="0"/>
+        <w:spacing w:after="160" w:line="259" w:lineRule="auto"/>
+        <w:jc w:val="both"/>
+        <w:rPr>
           <w:sz w:val="28"/>
           <w:szCs w:val="28"/>
         </w:rPr>
-        <w:t>"Разработка защищенного REST API с интеграцией в CI/CD"</w:t>
-      </w:r>
+      </w:pPr>
     </w:p>
     <w:p>
       <w:pPr>
@@ -286,7 +293,7 @@
         <w:adjustRightInd w:val="0"/>
         <w:snapToGrid w:val="0"/>
         <w:spacing w:after="160" w:line="259" w:lineRule="auto"/>
-        <w:jc w:val="both"/>
+        <w:jc w:val="right"/>
         <w:rPr>
           <w:sz w:val="28"/>
           <w:szCs w:val="28"/>
@@ -299,25 +306,19 @@
         <w:adjustRightInd w:val="0"/>
         <w:snapToGrid w:val="0"/>
         <w:spacing w:after="160" w:line="259" w:lineRule="auto"/>
-        <w:jc w:val="both"/>
+        <w:jc w:val="right"/>
         <w:rPr>
           <w:sz w:val="28"/>
           <w:szCs w:val="28"/>
         </w:rPr>
       </w:pPr>
-    </w:p>
-    <w:p>
-      <w:pPr>
-        <w:pStyle w:val="p1"/>
-        <w:adjustRightInd w:val="0"/>
-        <w:snapToGrid w:val="0"/>
-        <w:spacing w:after="160" w:line="259" w:lineRule="auto"/>
-        <w:jc w:val="right"/>
+      <w:r>
         <w:rPr>
           <w:sz w:val="28"/>
           <w:szCs w:val="28"/>
         </w:rPr>
-      </w:pPr>
+        <w:t>Выполнил:</w:t>
+      </w:r>
     </w:p>
     <w:p>
       <w:pPr>
@@ -336,7 +337,7 @@
           <w:sz w:val="28"/>
           <w:szCs w:val="28"/>
         </w:rPr>
-        <w:t>Выполнил:</w:t>
+        <w:t>Федоров Евгений Константинович</w:t>
       </w:r>
     </w:p>
     <w:p>
@@ -356,35 +357,54 @@
           <w:sz w:val="28"/>
           <w:szCs w:val="28"/>
         </w:rPr>
-        <w:t>Федоров Евгений Константинович</w:t>
-      </w:r>
-    </w:p>
-    <w:p>
-      <w:pPr>
-        <w:pStyle w:val="p1"/>
-        <w:adjustRightInd w:val="0"/>
-        <w:snapToGrid w:val="0"/>
-        <w:spacing w:after="160" w:line="259" w:lineRule="auto"/>
-        <w:jc w:val="right"/>
+        <w:t>Группа: P34</w:t>
+      </w:r>
+      <w:r>
         <w:rPr>
           <w:sz w:val="28"/>
           <w:szCs w:val="28"/>
         </w:rPr>
-      </w:pPr>
-      <w:r>
+        <w:t>10</w:t>
+      </w:r>
+    </w:p>
+    <w:p>
+      <w:pPr>
+        <w:pStyle w:val="p1"/>
+        <w:adjustRightInd w:val="0"/>
+        <w:snapToGrid w:val="0"/>
+        <w:spacing w:after="160" w:line="259" w:lineRule="auto"/>
+        <w:jc w:val="both"/>
         <w:rPr>
           <w:sz w:val="28"/>
           <w:szCs w:val="28"/>
         </w:rPr>
-        <w:t>Группа: P34</w:t>
-      </w:r>
-      <w:r>
+      </w:pPr>
+    </w:p>
+    <w:p>
+      <w:pPr>
+        <w:pStyle w:val="p1"/>
+        <w:adjustRightInd w:val="0"/>
+        <w:snapToGrid w:val="0"/>
+        <w:spacing w:after="160" w:line="259" w:lineRule="auto"/>
+        <w:jc w:val="both"/>
         <w:rPr>
           <w:sz w:val="28"/>
           <w:szCs w:val="28"/>
         </w:rPr>
-        <w:t>10</w:t>
-      </w:r>
+      </w:pPr>
+    </w:p>
+    <w:p>
+      <w:pPr>
+        <w:pStyle w:val="p1"/>
+        <w:adjustRightInd w:val="0"/>
+        <w:snapToGrid w:val="0"/>
+        <w:spacing w:after="160" w:line="259" w:lineRule="auto"/>
+        <w:jc w:val="both"/>
+        <w:rPr>
+          <w:sz w:val="28"/>
+          <w:szCs w:val="28"/>
+        </w:rPr>
+      </w:pPr>
     </w:p>
     <w:p>
       <w:pPr>
@@ -871,7 +891,7 @@
                 <w:noProof/>
                 <w:webHidden/>
               </w:rPr>
-              <w:t>4</w:t>
+              <w:t>5</w:t>
             </w:r>
             <w:r>
               <w:rPr>
@@ -964,7 +984,7 @@
                 <w:noProof/>
                 <w:webHidden/>
               </w:rPr>
-              <w:t>4</w:t>
+              <w:t>5</w:t>
             </w:r>
             <w:r>
               <w:rPr>
@@ -1042,7 +1062,7 @@
                 <w:noProof/>
                 <w:webHidden/>
               </w:rPr>
-              <w:t>4</w:t>
+              <w:t>5</w:t>
             </w:r>
             <w:r>
               <w:rPr>
@@ -1101,7 +1121,6 @@
         <w:adjustRightInd w:val="0"/>
         <w:snapToGrid w:val="0"/>
         <w:spacing w:after="160" w:line="259" w:lineRule="auto"/>
-        <w:jc w:val="both"/>
       </w:pPr>
       <w:r>
         <w:t>Для данного проекта был создан репозиторий G</w:t>
@@ -1116,7 +1135,10 @@
         <w:t xml:space="preserve"> и</w:t>
       </w:r>
       <w:r>
-        <w:t xml:space="preserve"> был связан с репозиторием на </w:t>
+        <w:t xml:space="preserve"> был связан с репозиторием на</w:t>
+      </w:r>
+      <w:r>
+        <w:t xml:space="preserve"> </w:t>
       </w:r>
       <w:r>
         <w:rPr>
@@ -1204,6 +1226,42 @@
       </w:r>
       <w:r>
         <w:t>. У аутентифицированных пользователей есть возможность просмотра других зарегистрированных в системе пользователей, отправки им сообщений по логину и просмотра собственных сообщений.</w:t>
+      </w:r>
+    </w:p>
+    <w:p>
+      <w:r>
+        <w:rPr>
+          <w:shd w:val="clear" w:color="auto" w:fill="FFFFFF"/>
+        </w:rPr>
+        <w:t xml:space="preserve">Приложение написано на Java 17 с использованием Spring Boot (Spring Web MVC, Spring Security, Spring Data JPA), в качестве СУБД используется </w:t>
+      </w:r>
+      <w:proofErr w:type="spellStart"/>
+      <w:r>
+        <w:rPr>
+          <w:shd w:val="clear" w:color="auto" w:fill="FFFFFF"/>
+        </w:rPr>
+        <w:t>PostgreSQL</w:t>
+      </w:r>
+      <w:proofErr w:type="spellEnd"/>
+      <w:r>
+        <w:rPr>
+          <w:shd w:val="clear" w:color="auto" w:fill="FFFFFF"/>
+        </w:rPr>
+        <w:t xml:space="preserve">, для сборки и запуска проверок — </w:t>
+      </w:r>
+      <w:proofErr w:type="spellStart"/>
+      <w:r>
+        <w:rPr>
+          <w:shd w:val="clear" w:color="auto" w:fill="FFFFFF"/>
+        </w:rPr>
+        <w:t>Maven</w:t>
+      </w:r>
+      <w:proofErr w:type="spellEnd"/>
+      <w:r>
+        <w:rPr>
+          <w:shd w:val="clear" w:color="auto" w:fill="FFFFFF"/>
+        </w:rPr>
+        <w:t>.</w:t>
       </w:r>
     </w:p>
     <w:p>
@@ -1550,7 +1608,6 @@
         <w:jc w:val="both"/>
       </w:pPr>
       <w:r>
-        <w:lastRenderedPageBreak/>
         <w:t xml:space="preserve">Формат ответа: </w:t>
       </w:r>
     </w:p>
@@ -2369,7 +2426,6 @@
         <w:rPr>
           <w:lang w:val="en-US"/>
         </w:rPr>
-        <w:lastRenderedPageBreak/>
         <w:t>POST</w:t>
       </w:r>
       <w:r>
@@ -2472,6 +2528,14 @@
                 <w:sz w:val="24"/>
                 <w:lang w:val="en-US"/>
               </w:rPr>
+              <w:t xml:space="preserve">    </w:t>
+            </w:r>
+            <w:r>
+              <w:rPr>
+                <w:rFonts w:ascii="Courier New" w:hAnsi="Courier New" w:cs="Courier New"/>
+                <w:sz w:val="24"/>
+                <w:lang w:val="en-US"/>
+              </w:rPr>
               <w:t>"recipient": "bob",</w:t>
             </w:r>
           </w:p>
@@ -2496,6 +2560,21 @@
                 <w:sz w:val="24"/>
                 <w:lang w:val="en-US"/>
               </w:rPr>
+              <w:t xml:space="preserve">   </w:t>
+            </w:r>
+            <w:r>
+              <w:rPr>
+                <w:rFonts w:ascii="Courier New" w:hAnsi="Courier New" w:cs="Courier New"/>
+                <w:sz w:val="24"/>
+              </w:rPr>
+              <w:t xml:space="preserve"> </w:t>
+            </w:r>
+            <w:r>
+              <w:rPr>
+                <w:rFonts w:ascii="Courier New" w:hAnsi="Courier New" w:cs="Courier New"/>
+                <w:sz w:val="24"/>
+                <w:lang w:val="en-US"/>
+              </w:rPr>
               <w:t>"text": "hey</w:t>
             </w:r>
             <w:r>
@@ -2524,11 +2603,15 @@
               <w:ind w:left="0"/>
               <w:contextualSpacing w:val="0"/>
               <w:jc w:val="both"/>
+              <w:rPr>
+                <w:lang w:val="en-US"/>
+              </w:rPr>
             </w:pPr>
             <w:r>
               <w:rPr>
                 <w:rFonts w:ascii="Courier New" w:hAnsi="Courier New" w:cs="Courier New"/>
                 <w:sz w:val="24"/>
+                <w:lang w:val="en-US"/>
               </w:rPr>
               <w:t>}</w:t>
             </w:r>
@@ -2934,6 +3017,14 @@
                 <w:sz w:val="24"/>
                 <w:lang w:val="en-US"/>
               </w:rPr>
+              <w:t xml:space="preserve">        </w:t>
+            </w:r>
+            <w:r>
+              <w:rPr>
+                <w:rFonts w:ascii="Courier New" w:hAnsi="Courier New" w:cs="Courier New"/>
+                <w:sz w:val="24"/>
+                <w:lang w:val="en-US"/>
+              </w:rPr>
               <w:t>"id": 1,</w:t>
             </w:r>
           </w:p>
@@ -2958,6 +3049,14 @@
                 <w:sz w:val="24"/>
                 <w:lang w:val="en-US"/>
               </w:rPr>
+              <w:t xml:space="preserve">        </w:t>
+            </w:r>
+            <w:r>
+              <w:rPr>
+                <w:rFonts w:ascii="Courier New" w:hAnsi="Courier New" w:cs="Courier New"/>
+                <w:sz w:val="24"/>
+                <w:lang w:val="en-US"/>
+              </w:rPr>
               <w:t>"from": "</w:t>
             </w:r>
             <w:proofErr w:type="spellStart"/>
@@ -3000,6 +3099,14 @@
                 <w:sz w:val="24"/>
                 <w:lang w:val="en-US"/>
               </w:rPr>
+              <w:t xml:space="preserve">        </w:t>
+            </w:r>
+            <w:r>
+              <w:rPr>
+                <w:rFonts w:ascii="Courier New" w:hAnsi="Courier New" w:cs="Courier New"/>
+                <w:sz w:val="24"/>
+                <w:lang w:val="en-US"/>
+              </w:rPr>
               <w:t>"to": "bob",</w:t>
             </w:r>
           </w:p>
@@ -3024,6 +3131,14 @@
                 <w:sz w:val="24"/>
                 <w:lang w:val="en-US"/>
               </w:rPr>
+              <w:t xml:space="preserve">        </w:t>
+            </w:r>
+            <w:r>
+              <w:rPr>
+                <w:rFonts w:ascii="Courier New" w:hAnsi="Courier New" w:cs="Courier New"/>
+                <w:sz w:val="24"/>
+                <w:lang w:val="en-US"/>
+              </w:rPr>
               <w:t>"text": "h</w:t>
             </w:r>
             <w:r>
@@ -3062,6 +3177,13 @@
               <w:rPr>
                 <w:rFonts w:ascii="Courier New" w:hAnsi="Courier New" w:cs="Courier New"/>
                 <w:sz w:val="24"/>
+              </w:rPr>
+              <w:t xml:space="preserve">        </w:t>
+            </w:r>
+            <w:r>
+              <w:rPr>
+                <w:rFonts w:ascii="Courier New" w:hAnsi="Courier New" w:cs="Courier New"/>
+                <w:sz w:val="24"/>
                 <w:lang w:val="en-US"/>
               </w:rPr>
               <w:t>"</w:t>
@@ -3169,645 +3291,512 @@
     </w:p>
     <w:p>
       <w:pPr>
-        <w:pStyle w:val="a5"/>
-        <w:adjustRightInd w:val="0"/>
-        <w:snapToGrid w:val="0"/>
-        <w:spacing w:after="160" w:line="259" w:lineRule="auto"/>
-        <w:ind w:left="0"/>
-        <w:contextualSpacing w:val="0"/>
-        <w:jc w:val="both"/>
+        <w:pStyle w:val="1"/>
+        <w:adjustRightInd w:val="0"/>
+        <w:snapToGrid w:val="0"/>
+        <w:spacing w:before="0" w:after="160" w:line="259" w:lineRule="auto"/>
+        <w:jc w:val="both"/>
+      </w:pPr>
+      <w:bookmarkStart w:id="3" w:name="_Toc240403671"/>
+      <w:r>
+        <w:lastRenderedPageBreak/>
+        <w:t>Защита от S</w:t>
+      </w:r>
+      <w:r>
         <w:rPr>
           <w:lang w:val="en-US"/>
         </w:rPr>
-      </w:pPr>
-    </w:p>
-    <w:p>
-      <w:pPr>
-        <w:pStyle w:val="a5"/>
-        <w:adjustRightInd w:val="0"/>
-        <w:snapToGrid w:val="0"/>
-        <w:spacing w:after="160" w:line="259" w:lineRule="auto"/>
-        <w:ind w:left="0"/>
-        <w:contextualSpacing w:val="0"/>
-        <w:jc w:val="both"/>
+        <w:t>QL</w:t>
+      </w:r>
+      <w:r>
+        <w:t>-и</w:t>
+      </w:r>
+      <w:r>
+        <w:t>нъекций</w:t>
+      </w:r>
+      <w:bookmarkEnd w:id="3"/>
+    </w:p>
+    <w:p>
+      <w:pPr>
+        <w:adjustRightInd w:val="0"/>
+        <w:snapToGrid w:val="0"/>
+        <w:spacing w:after="160" w:line="259" w:lineRule="auto"/>
+        <w:jc w:val="both"/>
+      </w:pPr>
+      <w:r>
+        <w:t xml:space="preserve">Защита от SQL-инъекций обеспечивается использованием Spring Data JPA поверх </w:t>
+      </w:r>
+      <w:proofErr w:type="spellStart"/>
+      <w:r>
+        <w:t>Hibernate</w:t>
+      </w:r>
+      <w:proofErr w:type="spellEnd"/>
+      <w:r>
+        <w:t xml:space="preserve">. Все обращения к БД идут через методы репозиториев, которые </w:t>
+      </w:r>
+      <w:proofErr w:type="spellStart"/>
+      <w:r>
+        <w:t>Hibernate</w:t>
+      </w:r>
+      <w:proofErr w:type="spellEnd"/>
+      <w:r>
+        <w:t xml:space="preserve"> транслирует в параметризованные подготовленные</w:t>
+      </w:r>
+      <w:r>
+        <w:t xml:space="preserve"> </w:t>
+      </w:r>
+      <w:r>
+        <w:t>запросы (</w:t>
+      </w:r>
+      <w:proofErr w:type="spellStart"/>
+      <w:r>
+        <w:t>PreparedStatement</w:t>
+      </w:r>
+      <w:proofErr w:type="spellEnd"/>
+      <w:r>
+        <w:t xml:space="preserve">) согласно спецификации JPA. Конкатенации </w:t>
+      </w:r>
+      <w:r>
+        <w:t>с</w:t>
+      </w:r>
+      <w:r>
+        <w:t>трок при построении SQL в проекте нет ни в одном месте, пользовательские данные всегда передаются как связанные параметры, а не встраиваются в текст запроса.</w:t>
+      </w:r>
+    </w:p>
+    <w:p>
+      <w:pPr>
+        <w:adjustRightInd w:val="0"/>
+        <w:snapToGrid w:val="0"/>
+        <w:spacing w:after="160" w:line="259" w:lineRule="auto"/>
+        <w:jc w:val="both"/>
+      </w:pPr>
+    </w:p>
+    <w:p>
+      <w:pPr>
+        <w:pStyle w:val="1"/>
+        <w:adjustRightInd w:val="0"/>
+        <w:snapToGrid w:val="0"/>
+        <w:spacing w:before="0" w:after="160" w:line="259" w:lineRule="auto"/>
+        <w:jc w:val="both"/>
+      </w:pPr>
+      <w:bookmarkStart w:id="4" w:name="_Toc240403672"/>
+      <w:r>
+        <w:t xml:space="preserve">Защита от </w:t>
+      </w:r>
+      <w:r>
         <w:rPr>
           <w:lang w:val="en-US"/>
         </w:rPr>
-      </w:pPr>
-    </w:p>
-    <w:p>
-      <w:pPr>
-        <w:pStyle w:val="a5"/>
-        <w:adjustRightInd w:val="0"/>
-        <w:snapToGrid w:val="0"/>
-        <w:spacing w:after="160" w:line="259" w:lineRule="auto"/>
-        <w:ind w:left="0"/>
-        <w:contextualSpacing w:val="0"/>
-        <w:jc w:val="both"/>
+        <w:t>XSS-</w:t>
+      </w:r>
+      <w:r>
+        <w:t>атак</w:t>
+      </w:r>
+      <w:bookmarkEnd w:id="4"/>
+    </w:p>
+    <w:p>
+      <w:pPr>
+        <w:adjustRightInd w:val="0"/>
+        <w:snapToGrid w:val="0"/>
+        <w:spacing w:after="160" w:line="259" w:lineRule="auto"/>
+        <w:jc w:val="both"/>
+      </w:pPr>
+      <w:r>
+        <w:t xml:space="preserve">Приложение является чистым REST API и не генерирует HTML: все ответы отдаются в формате </w:t>
+      </w:r>
+      <w:proofErr w:type="spellStart"/>
+      <w:r>
+        <w:t>application</w:t>
+      </w:r>
+      <w:proofErr w:type="spellEnd"/>
+      <w:r>
+        <w:t>/</w:t>
+      </w:r>
+      <w:proofErr w:type="spellStart"/>
+      <w:r>
+        <w:t>json</w:t>
+      </w:r>
+      <w:proofErr w:type="spellEnd"/>
+      <w:r>
+        <w:t xml:space="preserve"> и </w:t>
+      </w:r>
+      <w:proofErr w:type="spellStart"/>
+      <w:r>
+        <w:t>сериализуются</w:t>
+      </w:r>
+      <w:proofErr w:type="spellEnd"/>
+      <w:r>
+        <w:t xml:space="preserve"> библиотекой </w:t>
+      </w:r>
+      <w:proofErr w:type="spellStart"/>
+      <w:r>
+        <w:t>Jackson</w:t>
+      </w:r>
+      <w:proofErr w:type="spellEnd"/>
+      <w:r>
+        <w:t xml:space="preserve">, входящей в Spring Boot. </w:t>
+      </w:r>
+      <w:proofErr w:type="spellStart"/>
+      <w:r>
+        <w:t>Jackson</w:t>
+      </w:r>
+      <w:proofErr w:type="spellEnd"/>
+      <w:r>
+        <w:t xml:space="preserve"> при </w:t>
+      </w:r>
+      <w:proofErr w:type="spellStart"/>
+      <w:r>
+        <w:t>сериализации</w:t>
+      </w:r>
+      <w:proofErr w:type="spellEnd"/>
+      <w:r>
+        <w:t xml:space="preserve"> экранирует</w:t>
+      </w:r>
+      <w:r>
+        <w:t xml:space="preserve"> </w:t>
+      </w:r>
+      <w:r>
+        <w:t>специальные и управляющие символы (кавычки, переводы строк и т.д.) по правилам JSON</w:t>
+      </w:r>
+      <w:r>
+        <w:t>.</w:t>
+      </w:r>
+      <w:r>
+        <w:br/>
+        <w:t>Дополнительно реализована защита при помощи экранирования специальных символов HT</w:t>
+      </w:r>
+      <w:r>
         <w:rPr>
           <w:lang w:val="en-US"/>
         </w:rPr>
-      </w:pPr>
-    </w:p>
-    <w:p>
-      <w:pPr>
-        <w:pStyle w:val="a5"/>
-        <w:adjustRightInd w:val="0"/>
-        <w:snapToGrid w:val="0"/>
-        <w:spacing w:after="160" w:line="259" w:lineRule="auto"/>
-        <w:ind w:left="0"/>
-        <w:contextualSpacing w:val="0"/>
-        <w:jc w:val="both"/>
+        <w:t>ML</w:t>
+      </w:r>
+      <w:r>
+        <w:t xml:space="preserve"> </w:t>
+      </w:r>
+      <w:r>
+        <w:t>средствами фреймворка.</w:t>
+      </w:r>
+      <w:bookmarkStart w:id="5" w:name="_Toc240403673"/>
+    </w:p>
+    <w:p>
+      <w:pPr>
+        <w:adjustRightInd w:val="0"/>
+        <w:snapToGrid w:val="0"/>
+        <w:spacing w:after="160" w:line="259" w:lineRule="auto"/>
+        <w:jc w:val="both"/>
+      </w:pPr>
+    </w:p>
+    <w:p>
+      <w:pPr>
+        <w:pStyle w:val="1"/>
+      </w:pPr>
+      <w:r>
+        <w:t>Реализация аутентификации пользователя</w:t>
+      </w:r>
+      <w:bookmarkEnd w:id="5"/>
+    </w:p>
+    <w:p>
+      <w:r>
+        <w:br/>
+      </w:r>
+      <w:r>
+        <w:t xml:space="preserve">В работе используется JWT </w:t>
+      </w:r>
+      <w:proofErr w:type="spellStart"/>
+      <w:r>
+        <w:t>access</w:t>
+      </w:r>
+      <w:proofErr w:type="spellEnd"/>
+      <w:r>
+        <w:t>-токен</w:t>
+      </w:r>
+      <w:r>
+        <w:t xml:space="preserve">. </w:t>
+      </w:r>
+      <w:proofErr w:type="spellStart"/>
+      <w:r>
+        <w:t>Access</w:t>
+      </w:r>
+      <w:proofErr w:type="spellEnd"/>
+      <w:r>
+        <w:t xml:space="preserve">-токен служит для доступа к защищённым </w:t>
+      </w:r>
+      <w:proofErr w:type="spellStart"/>
+      <w:r>
+        <w:t>эндпоинтам</w:t>
+      </w:r>
+      <w:proofErr w:type="spellEnd"/>
+      <w:r>
+        <w:t>: именно по нему определяетс</w:t>
+      </w:r>
+      <w:r>
+        <w:t xml:space="preserve">я </w:t>
+      </w:r>
+      <w:r>
+        <w:t>пользователь. Время жизни токен</w:t>
+      </w:r>
+      <w:r>
+        <w:t xml:space="preserve"> – 1 час, </w:t>
+      </w:r>
+      <w:r>
+        <w:t>токен подписывается алгоритмом HS256 секретным ключо</w:t>
+      </w:r>
+      <w:r>
+        <w:t>м.</w:t>
+      </w:r>
+      <w:r>
+        <w:t xml:space="preserve"> </w:t>
+      </w:r>
+    </w:p>
+    <w:p>
+      <w:pPr>
+        <w:adjustRightInd w:val="0"/>
+        <w:snapToGrid w:val="0"/>
+        <w:spacing w:after="160" w:line="259" w:lineRule="auto"/>
+        <w:jc w:val="both"/>
+      </w:pPr>
+    </w:p>
+    <w:p>
+      <w:pPr>
+        <w:adjustRightInd w:val="0"/>
+        <w:snapToGrid w:val="0"/>
+        <w:spacing w:after="160" w:line="259" w:lineRule="auto"/>
+        <w:jc w:val="both"/>
+      </w:pPr>
+      <w:r>
+        <w:t>Токен выдаётся при регистрации POST /</w:t>
+      </w:r>
+      <w:proofErr w:type="spellStart"/>
+      <w:r>
+        <w:t>auth</w:t>
+      </w:r>
+      <w:proofErr w:type="spellEnd"/>
+      <w:r>
+        <w:t>/</w:t>
+      </w:r>
+      <w:proofErr w:type="spellStart"/>
+      <w:r>
+        <w:t>register</w:t>
+      </w:r>
+      <w:proofErr w:type="spellEnd"/>
+      <w:r>
+        <w:t xml:space="preserve"> и при входе POST /</w:t>
+      </w:r>
+      <w:proofErr w:type="spellStart"/>
+      <w:r>
+        <w:t>auth</w:t>
+      </w:r>
+      <w:proofErr w:type="spellEnd"/>
+      <w:r>
+        <w:t>/</w:t>
+      </w:r>
+      <w:proofErr w:type="spellStart"/>
+      <w:r>
+        <w:t>log</w:t>
+      </w:r>
+      <w:proofErr w:type="spellEnd"/>
+      <w:r>
         <w:rPr>
           <w:lang w:val="en-US"/>
         </w:rPr>
-      </w:pPr>
-    </w:p>
-    <w:p>
-      <w:pPr>
-        <w:pStyle w:val="a5"/>
-        <w:adjustRightInd w:val="0"/>
-        <w:snapToGrid w:val="0"/>
-        <w:spacing w:after="160" w:line="259" w:lineRule="auto"/>
-        <w:ind w:left="0"/>
-        <w:contextualSpacing w:val="0"/>
-        <w:jc w:val="both"/>
+        <w:t>in</w:t>
+      </w:r>
+      <w:r>
+        <w:t>.</w:t>
+      </w:r>
+    </w:p>
+    <w:p>
+      <w:pPr>
+        <w:adjustRightInd w:val="0"/>
+        <w:snapToGrid w:val="0"/>
+        <w:spacing w:after="160" w:line="259" w:lineRule="auto"/>
+        <w:jc w:val="both"/>
+      </w:pPr>
+      <w:r>
+        <w:t xml:space="preserve">                                                                                                                                                                                                      </w:t>
+      </w:r>
+    </w:p>
+    <w:p>
+      <w:pPr>
+        <w:adjustRightInd w:val="0"/>
+        <w:snapToGrid w:val="0"/>
+        <w:spacing w:after="160" w:line="259" w:lineRule="auto"/>
+        <w:jc w:val="both"/>
+      </w:pPr>
+      <w:r>
+        <w:t xml:space="preserve">На защищённых </w:t>
+      </w:r>
+      <w:proofErr w:type="spellStart"/>
+      <w:r>
+        <w:t>эндпоинтах</w:t>
+      </w:r>
+      <w:proofErr w:type="spellEnd"/>
+      <w:r>
+        <w:t xml:space="preserve"> стоит фильтр</w:t>
+      </w:r>
+      <w:r>
+        <w:t xml:space="preserve"> -</w:t>
+      </w:r>
+      <w:r>
+        <w:t xml:space="preserve"> он проверяет наличие и формат заголовка </w:t>
+      </w:r>
+      <w:proofErr w:type="spellStart"/>
+      <w:r>
+        <w:t>Authorization</w:t>
+      </w:r>
+      <w:proofErr w:type="spellEnd"/>
+      <w:r>
+        <w:t xml:space="preserve">: </w:t>
+      </w:r>
+      <w:proofErr w:type="spellStart"/>
+      <w:r>
+        <w:t>Bearer</w:t>
+      </w:r>
+      <w:proofErr w:type="spellEnd"/>
+      <w:r>
+        <w:t xml:space="preserve"> &lt;токен&gt;,</w:t>
+      </w:r>
+      <w:r>
+        <w:t xml:space="preserve"> </w:t>
+      </w:r>
+      <w:r>
+        <w:t>проверяет подпись и срок действия,</w:t>
+      </w:r>
+      <w:r>
+        <w:t xml:space="preserve"> </w:t>
+      </w:r>
+      <w:r>
+        <w:t>загружает пользователя из БД и устанавливает аутентификацию</w:t>
+      </w:r>
+      <w:r>
+        <w:t>.</w:t>
+      </w:r>
+    </w:p>
+    <w:p>
+      <w:pPr>
+        <w:adjustRightInd w:val="0"/>
+        <w:snapToGrid w:val="0"/>
+        <w:spacing w:after="160" w:line="259" w:lineRule="auto"/>
+        <w:jc w:val="both"/>
+      </w:pPr>
+    </w:p>
+    <w:p>
+      <w:pPr>
+        <w:adjustRightInd w:val="0"/>
+        <w:snapToGrid w:val="0"/>
+        <w:spacing w:after="160" w:line="259" w:lineRule="auto"/>
+        <w:jc w:val="both"/>
+      </w:pPr>
+      <w:r>
+        <w:t xml:space="preserve">В базе данных пароли хранятся только в виде хэшей </w:t>
+      </w:r>
+      <w:proofErr w:type="spellStart"/>
+      <w:r>
+        <w:t>bcrypt</w:t>
+      </w:r>
+      <w:proofErr w:type="spellEnd"/>
+      <w:r>
+        <w:t xml:space="preserve">, </w:t>
+      </w:r>
+      <w:r>
+        <w:t xml:space="preserve">сырые пароли нигде не сохраняются и не </w:t>
+      </w:r>
+      <w:proofErr w:type="spellStart"/>
+      <w:r>
+        <w:t>логируются</w:t>
+      </w:r>
+      <w:proofErr w:type="spellEnd"/>
+      <w:r>
+        <w:t>.</w:t>
+      </w:r>
+    </w:p>
+    <w:p>
+      <w:pPr>
+        <w:adjustRightInd w:val="0"/>
+        <w:snapToGrid w:val="0"/>
+        <w:spacing w:after="160" w:line="259" w:lineRule="auto"/>
+        <w:jc w:val="both"/>
+      </w:pPr>
+    </w:p>
+    <w:p>
+      <w:pPr>
+        <w:pStyle w:val="1"/>
         <w:rPr>
           <w:lang w:val="en-US"/>
         </w:rPr>
       </w:pPr>
-    </w:p>
-    <w:p>
-      <w:pPr>
-        <w:pStyle w:val="a5"/>
-        <w:adjustRightInd w:val="0"/>
-        <w:snapToGrid w:val="0"/>
-        <w:spacing w:after="160" w:line="259" w:lineRule="auto"/>
-        <w:ind w:left="0"/>
-        <w:contextualSpacing w:val="0"/>
-        <w:jc w:val="both"/>
+      <w:r>
+        <w:lastRenderedPageBreak/>
+        <w:t>По</w:t>
+      </w:r>
+      <w:r>
+        <w:t xml:space="preserve">лученные отчеты по </w:t>
+      </w:r>
+      <w:r>
         <w:rPr>
           <w:lang w:val="en-US"/>
         </w:rPr>
-      </w:pPr>
-    </w:p>
-    <w:p>
-      <w:pPr>
-        <w:adjustRightInd w:val="0"/>
-        <w:snapToGrid w:val="0"/>
-        <w:spacing w:after="160" w:line="259" w:lineRule="auto"/>
-        <w:jc w:val="both"/>
-      </w:pPr>
-    </w:p>
-    <w:p>
-      <w:pPr>
-        <w:pStyle w:val="1"/>
-        <w:adjustRightInd w:val="0"/>
-        <w:snapToGrid w:val="0"/>
-        <w:spacing w:before="0" w:after="160" w:line="259" w:lineRule="auto"/>
-        <w:jc w:val="both"/>
-      </w:pPr>
-      <w:bookmarkStart w:id="3" w:name="_Toc240403671"/>
-      <w:r>
-        <w:t>Защита от S</w:t>
+        <w:t>SAST</w:t>
+      </w:r>
+      <w:r>
+        <w:t>/</w:t>
       </w:r>
       <w:r>
         <w:rPr>
           <w:lang w:val="en-US"/>
         </w:rPr>
-        <w:t>QL-и</w:t>
-      </w:r>
-      <w:proofErr w:type="spellStart"/>
-      <w:r>
-        <w:t>нъекций</w:t>
-      </w:r>
-      <w:bookmarkEnd w:id="3"/>
-      <w:proofErr w:type="spellEnd"/>
-    </w:p>
-    <w:p>
-      <w:pPr>
-        <w:adjustRightInd w:val="0"/>
-        <w:snapToGrid w:val="0"/>
-        <w:spacing w:after="160" w:line="259" w:lineRule="auto"/>
-        <w:jc w:val="both"/>
-      </w:pPr>
-      <w:r>
-        <w:t xml:space="preserve">Защита от SQL-инъекций обеспечивается использованием Spring Data JPA поверх </w:t>
-      </w:r>
-      <w:proofErr w:type="spellStart"/>
-      <w:r>
-        <w:t>Hibernate</w:t>
-      </w:r>
-      <w:proofErr w:type="spellEnd"/>
-      <w:r>
-        <w:t xml:space="preserve">. Все обращения к БД идут через методы репозиториев, которые </w:t>
-      </w:r>
-      <w:proofErr w:type="spellStart"/>
-      <w:r>
-        <w:t>Hibernate</w:t>
-      </w:r>
-      <w:proofErr w:type="spellEnd"/>
-      <w:r>
-        <w:t xml:space="preserve"> транслирует в параметризованные подготовленные</w:t>
+        <w:t>SCA</w:t>
       </w:r>
       <w:r>
         <w:t xml:space="preserve"> </w:t>
       </w:r>
       <w:r>
-        <w:t>запросы (</w:t>
-      </w:r>
-      <w:proofErr w:type="spellStart"/>
-      <w:r>
-        <w:t>PreparedStatement</w:t>
-      </w:r>
-      <w:proofErr w:type="spellEnd"/>
-      <w:r>
-        <w:t xml:space="preserve">) согласно спецификации JPA. Конкатенации </w:t>
-      </w:r>
-      <w:r>
-        <w:t>с</w:t>
-      </w:r>
-      <w:r>
-        <w:t>трок при построении SQL в проекте нет ни в одном месте, пользовательские данные всегда передаются как связанные параметры, а не встраиваются в текст запроса.</w:t>
-      </w:r>
-    </w:p>
-    <w:p>
-      <w:pPr>
-        <w:adjustRightInd w:val="0"/>
-        <w:snapToGrid w:val="0"/>
-        <w:spacing w:after="160" w:line="259" w:lineRule="auto"/>
-        <w:jc w:val="both"/>
-      </w:pPr>
-    </w:p>
-    <w:p>
-      <w:pPr>
-        <w:pStyle w:val="1"/>
-        <w:adjustRightInd w:val="0"/>
-        <w:snapToGrid w:val="0"/>
-        <w:spacing w:before="0" w:after="160" w:line="259" w:lineRule="auto"/>
-        <w:jc w:val="both"/>
-      </w:pPr>
-      <w:bookmarkStart w:id="4" w:name="_Toc240403672"/>
-      <w:r>
-        <w:t xml:space="preserve">Защита от </w:t>
+        <w:t xml:space="preserve">из </w:t>
       </w:r>
       <w:r>
         <w:rPr>
           <w:lang w:val="en-US"/>
         </w:rPr>
-        <w:t>XSS-</w:t>
-      </w:r>
-      <w:r>
-        <w:t>атак</w:t>
-      </w:r>
-      <w:bookmarkEnd w:id="4"/>
-    </w:p>
-    <w:p>
-      <w:pPr>
-        <w:adjustRightInd w:val="0"/>
-        <w:snapToGrid w:val="0"/>
-        <w:spacing w:after="160" w:line="259" w:lineRule="auto"/>
-        <w:jc w:val="both"/>
-      </w:pPr>
-      <w:r>
-        <w:t xml:space="preserve">Приложение является чистым REST API и не генерирует HTML: все ответы отдаются в формате </w:t>
-      </w:r>
-      <w:proofErr w:type="spellStart"/>
-      <w:r>
-        <w:t>application</w:t>
-      </w:r>
-      <w:proofErr w:type="spellEnd"/>
-      <w:r>
-        <w:t>/</w:t>
-      </w:r>
-      <w:proofErr w:type="spellStart"/>
-      <w:r>
-        <w:t>json</w:t>
-      </w:r>
-      <w:proofErr w:type="spellEnd"/>
-      <w:r>
-        <w:t xml:space="preserve"> и </w:t>
-      </w:r>
-      <w:proofErr w:type="spellStart"/>
-      <w:r>
-        <w:t>сериализуются</w:t>
-      </w:r>
-      <w:proofErr w:type="spellEnd"/>
-      <w:r>
-        <w:t xml:space="preserve"> библиотекой </w:t>
-      </w:r>
-      <w:proofErr w:type="spellStart"/>
-      <w:r>
-        <w:t>Jackson</w:t>
-      </w:r>
-      <w:proofErr w:type="spellEnd"/>
-      <w:r>
-        <w:t xml:space="preserve">, входящей в Spring Boot. </w:t>
-      </w:r>
-      <w:proofErr w:type="spellStart"/>
-      <w:r>
-        <w:t>Jackson</w:t>
-      </w:r>
-      <w:proofErr w:type="spellEnd"/>
-      <w:r>
-        <w:t xml:space="preserve"> при </w:t>
-      </w:r>
-      <w:proofErr w:type="spellStart"/>
-      <w:r>
-        <w:t>сериализации</w:t>
-      </w:r>
-      <w:proofErr w:type="spellEnd"/>
-      <w:r>
-        <w:t xml:space="preserve"> экранирует</w:t>
-      </w:r>
-      <w:r>
-        <w:t xml:space="preserve"> </w:t>
-      </w:r>
-      <w:r>
-        <w:t>специальные и управляющие символы (кавычки, переводы строк и т.д.) по правилам JSON, поэтому пользовательские данные (логины, тексты сообщений) не могут «вырваться» за пределы строкового значения и изменить</w:t>
-      </w:r>
-      <w:r>
-        <w:t xml:space="preserve"> </w:t>
-      </w:r>
-      <w:r>
-        <w:t xml:space="preserve">структуру ответа. Поскольку браузер не исполняет контент с типом </w:t>
-      </w:r>
-      <w:proofErr w:type="spellStart"/>
-      <w:r>
-        <w:t>application</w:t>
-      </w:r>
-      <w:proofErr w:type="spellEnd"/>
-      <w:r>
-        <w:t>/</w:t>
-      </w:r>
-      <w:proofErr w:type="spellStart"/>
-      <w:r>
-        <w:t>json</w:t>
-      </w:r>
-      <w:proofErr w:type="spellEnd"/>
-      <w:r>
-        <w:t>, внедрённый в поля скрипт не выполняется сам по себе; экранирование при отображении возлагается на клиент (современные</w:t>
-      </w:r>
-      <w:r>
-        <w:t xml:space="preserve"> </w:t>
-      </w:r>
-      <w:r>
-        <w:t xml:space="preserve">фреймворки типа </w:t>
-      </w:r>
-      <w:proofErr w:type="spellStart"/>
-      <w:r>
-        <w:t>React</w:t>
-      </w:r>
-      <w:proofErr w:type="spellEnd"/>
-      <w:r>
-        <w:t xml:space="preserve"> экранируют по </w:t>
-      </w:r>
-      <w:r>
-        <w:t>у</w:t>
-      </w:r>
-      <w:r>
-        <w:t xml:space="preserve">молчанию). </w:t>
-      </w:r>
-    </w:p>
-    <w:p>
-      <w:pPr>
-        <w:adjustRightInd w:val="0"/>
-        <w:snapToGrid w:val="0"/>
-        <w:spacing w:after="160" w:line="259" w:lineRule="auto"/>
-        <w:jc w:val="both"/>
-      </w:pPr>
-    </w:p>
-    <w:p>
-      <w:pPr>
-        <w:rPr>
-          <w:rFonts w:eastAsiaTheme="majorEastAsia" w:cstheme="majorBidi"/>
-          <w:b/>
-          <w:color w:val="000000" w:themeColor="text1"/>
-          <w:sz w:val="32"/>
-          <w:szCs w:val="32"/>
-        </w:rPr>
-      </w:pPr>
-      <w:bookmarkStart w:id="5" w:name="_Toc240403673"/>
-      <w:r>
-        <w:br w:type="page"/>
-      </w:r>
-    </w:p>
-    <w:p>
-      <w:pPr>
-        <w:pStyle w:val="1"/>
-        <w:adjustRightInd w:val="0"/>
-        <w:snapToGrid w:val="0"/>
-        <w:spacing w:before="0" w:after="160" w:line="259" w:lineRule="auto"/>
-        <w:jc w:val="both"/>
-      </w:pPr>
-      <w:r>
-        <w:lastRenderedPageBreak/>
-        <w:t>Реализация аутентификации пользователя</w:t>
-      </w:r>
-      <w:bookmarkEnd w:id="5"/>
-    </w:p>
-    <w:p>
-      <w:pPr>
-        <w:adjustRightInd w:val="0"/>
-        <w:snapToGrid w:val="0"/>
-        <w:spacing w:after="160" w:line="259" w:lineRule="auto"/>
-        <w:jc w:val="both"/>
-      </w:pPr>
-      <w:r>
-        <w:t xml:space="preserve">В работе используется JWT </w:t>
-      </w:r>
-      <w:proofErr w:type="spellStart"/>
-      <w:r>
-        <w:t>access</w:t>
-      </w:r>
-      <w:proofErr w:type="spellEnd"/>
-      <w:r>
-        <w:t>-токен</w:t>
-      </w:r>
-      <w:r>
-        <w:t xml:space="preserve">. </w:t>
-      </w:r>
-      <w:proofErr w:type="spellStart"/>
-      <w:r>
-        <w:t>Access</w:t>
-      </w:r>
-      <w:proofErr w:type="spellEnd"/>
-      <w:r>
-        <w:t xml:space="preserve">-токен служит для доступа к защищённым </w:t>
-      </w:r>
-      <w:proofErr w:type="spellStart"/>
-      <w:r>
-        <w:t>эндпоинтам</w:t>
-      </w:r>
-      <w:proofErr w:type="spellEnd"/>
-      <w:r>
-        <w:t>: именно по нему определяетс</w:t>
-      </w:r>
-      <w:r>
-        <w:t xml:space="preserve">я </w:t>
-      </w:r>
-      <w:r>
-        <w:t>пользователь. Время жизни токен</w:t>
-      </w:r>
-      <w:r>
-        <w:t xml:space="preserve"> – 1 час, </w:t>
-      </w:r>
-      <w:r>
-        <w:t>токен подписывается алгоритмом HS256 секретным ключо</w:t>
-      </w:r>
-      <w:r>
-        <w:t>м.</w:t>
-      </w:r>
-      <w:r>
-        <w:t xml:space="preserve"> </w:t>
-      </w:r>
-    </w:p>
-    <w:p>
-      <w:pPr>
-        <w:adjustRightInd w:val="0"/>
-        <w:snapToGrid w:val="0"/>
-        <w:spacing w:after="160" w:line="259" w:lineRule="auto"/>
-        <w:jc w:val="both"/>
-      </w:pPr>
-    </w:p>
-    <w:p>
-      <w:pPr>
-        <w:adjustRightInd w:val="0"/>
-        <w:snapToGrid w:val="0"/>
-        <w:spacing w:after="160" w:line="259" w:lineRule="auto"/>
-        <w:jc w:val="both"/>
-      </w:pPr>
-      <w:r>
-        <w:t>Токен выдаётся при регистрации POST /</w:t>
-      </w:r>
-      <w:proofErr w:type="spellStart"/>
-      <w:r>
-        <w:t>auth</w:t>
-      </w:r>
-      <w:proofErr w:type="spellEnd"/>
-      <w:r>
-        <w:t>/</w:t>
-      </w:r>
-      <w:proofErr w:type="spellStart"/>
-      <w:r>
-        <w:t>register</w:t>
-      </w:r>
-      <w:proofErr w:type="spellEnd"/>
-      <w:r>
-        <w:t xml:space="preserve"> и при входе POST /</w:t>
-      </w:r>
-      <w:proofErr w:type="spellStart"/>
-      <w:r>
-        <w:t>auth</w:t>
-      </w:r>
-      <w:proofErr w:type="spellEnd"/>
-      <w:r>
-        <w:t>/</w:t>
-      </w:r>
-      <w:proofErr w:type="spellStart"/>
-      <w:r>
-        <w:t>log</w:t>
-      </w:r>
-      <w:proofErr w:type="spellEnd"/>
-      <w:r>
+        <w:t>Actions</w:t>
+      </w:r>
+    </w:p>
+    <w:p>
+      <w:pPr>
         <w:rPr>
           <w:lang w:val="en-US"/>
         </w:rPr>
-        <w:t>in</w:t>
-      </w:r>
-      <w:r>
-        <w:t>.</w:t>
-      </w:r>
-    </w:p>
-    <w:p>
-      <w:pPr>
-        <w:adjustRightInd w:val="0"/>
-        <w:snapToGrid w:val="0"/>
-        <w:spacing w:after="160" w:line="259" w:lineRule="auto"/>
-        <w:jc w:val="both"/>
-      </w:pPr>
-      <w:r>
-        <w:t xml:space="preserve">                                                                                                                                                                                                      </w:t>
-      </w:r>
-    </w:p>
-    <w:p>
-      <w:pPr>
-        <w:adjustRightInd w:val="0"/>
-        <w:snapToGrid w:val="0"/>
-        <w:spacing w:after="160" w:line="259" w:lineRule="auto"/>
-        <w:jc w:val="both"/>
-      </w:pPr>
-      <w:r>
-        <w:t xml:space="preserve">На защищённых </w:t>
-      </w:r>
-      <w:proofErr w:type="spellStart"/>
-      <w:r>
-        <w:t>эндпоинтах</w:t>
-      </w:r>
-      <w:proofErr w:type="spellEnd"/>
-      <w:r>
-        <w:t xml:space="preserve"> стоит фильтр</w:t>
-      </w:r>
-      <w:r>
-        <w:t xml:space="preserve"> -</w:t>
-      </w:r>
-      <w:r>
-        <w:t xml:space="preserve"> он проверяет наличие и формат заголовка </w:t>
-      </w:r>
-      <w:proofErr w:type="spellStart"/>
-      <w:r>
-        <w:t>Authorization</w:t>
-      </w:r>
-      <w:proofErr w:type="spellEnd"/>
-      <w:r>
-        <w:t xml:space="preserve">: </w:t>
-      </w:r>
-      <w:proofErr w:type="spellStart"/>
-      <w:r>
-        <w:t>Bearer</w:t>
-      </w:r>
-      <w:proofErr w:type="spellEnd"/>
-      <w:r>
-        <w:t xml:space="preserve"> &lt;токен&gt;,</w:t>
-      </w:r>
-      <w:r>
-        <w:t xml:space="preserve"> </w:t>
-      </w:r>
-      <w:r>
-        <w:t>проверяет подпись и срок действия,</w:t>
-      </w:r>
-      <w:r>
-        <w:t xml:space="preserve"> </w:t>
-      </w:r>
-      <w:r>
-        <w:t>загружает пользователя из БД и устанавливает аутентификацию</w:t>
-      </w:r>
-      <w:r>
-        <w:t>.</w:t>
-      </w:r>
-    </w:p>
-    <w:p>
-      <w:pPr>
-        <w:adjustRightInd w:val="0"/>
-        <w:snapToGrid w:val="0"/>
-        <w:spacing w:after="160" w:line="259" w:lineRule="auto"/>
-        <w:jc w:val="both"/>
-      </w:pPr>
-    </w:p>
-    <w:p>
-      <w:pPr>
-        <w:adjustRightInd w:val="0"/>
-        <w:snapToGrid w:val="0"/>
-        <w:spacing w:after="160" w:line="259" w:lineRule="auto"/>
-        <w:jc w:val="both"/>
-      </w:pPr>
-      <w:r>
-        <w:t xml:space="preserve">В базе данных пароли хранятся только в виде хэшей </w:t>
-      </w:r>
-      <w:proofErr w:type="spellStart"/>
-      <w:r>
-        <w:t>bcrypt</w:t>
-      </w:r>
-      <w:proofErr w:type="spellEnd"/>
-      <w:r>
-        <w:t xml:space="preserve">, </w:t>
-      </w:r>
-      <w:r>
-        <w:t xml:space="preserve">сырые пароли нигде не сохраняются и не </w:t>
-      </w:r>
-      <w:proofErr w:type="spellStart"/>
-      <w:r>
-        <w:t>логируются</w:t>
-      </w:r>
-      <w:proofErr w:type="spellEnd"/>
-      <w:r>
-        <w:t>.</w:t>
-      </w:r>
-    </w:p>
-    <w:p>
-      <w:pPr>
-        <w:adjustRightInd w:val="0"/>
-        <w:snapToGrid w:val="0"/>
-        <w:spacing w:after="160" w:line="259" w:lineRule="auto"/>
-        <w:jc w:val="both"/>
-      </w:pPr>
-    </w:p>
-    <w:p>
-      <w:pPr>
-        <w:pStyle w:val="1"/>
+      </w:pPr>
+    </w:p>
+    <w:p>
+      <w:pPr>
         <w:rPr>
           <w:lang w:val="en-US"/>
         </w:rPr>
       </w:pPr>
       <w:r>
-        <w:t>По</w:t>
-      </w:r>
-      <w:r>
-        <w:t xml:space="preserve">лученные отчеты по </w:t>
-      </w:r>
-      <w:r>
         <w:rPr>
           <w:lang w:val="en-US"/>
         </w:rPr>
-        <w:t>SAST</w:t>
-      </w:r>
-      <w:r>
-        <w:t>/</w:t>
-      </w:r>
-      <w:r>
+        <w:t xml:space="preserve">SAST: </w:t>
+      </w:r>
+    </w:p>
+    <w:p>
+      <w:pPr>
         <w:rPr>
           <w:lang w:val="en-US"/>
         </w:rPr>
-        <w:t>SCA</w:t>
-      </w:r>
-      <w:r>
-        <w:t xml:space="preserve"> </w:t>
-      </w:r>
-      <w:r>
-        <w:t xml:space="preserve">из </w:t>
-      </w:r>
-      <w:r>
-        <w:rPr>
+      </w:pPr>
+      <w:r>
+        <w:rPr>
+          <w:noProof/>
           <w:lang w:val="en-US"/>
         </w:rPr>
-        <w:t>Actions</w:t>
-      </w:r>
-    </w:p>
-    <w:p>
-      <w:pPr>
-        <w:rPr>
-          <w:lang w:val="en-US"/>
-        </w:rPr>
-      </w:pPr>
-    </w:p>
-    <w:p>
-      <w:pPr>
-        <w:rPr>
-          <w:lang w:val="en-US"/>
-        </w:rPr>
-      </w:pPr>
-      <w:r>
-        <w:rPr>
-          <w:lang w:val="en-US"/>
-        </w:rPr>
-        <w:t xml:space="preserve">SAST: </w:t>
-      </w:r>
-    </w:p>
-    <w:p>
-      <w:pPr>
-        <w:rPr>
-          <w:lang w:val="en-US"/>
-        </w:rPr>
-      </w:pPr>
-      <w:r>
-        <w:rPr>
-          <w:lang w:val="en-US"/>
-        </w:rPr>
         <w:drawing>
-          <wp:inline distT="0" distB="0" distL="0" distR="0" wp14:anchorId="6EBCB89C" wp14:editId="179675AA">
-            <wp:extent cx="5549826" cy="3884997"/>
-            <wp:effectExtent l="0" t="0" r="635" b="1270"/>
-            <wp:docPr id="1264360541" name="Рисунок 1"/>
+          <wp:inline distT="0" distB="0" distL="0" distR="0">
+            <wp:extent cx="5100647" cy="3793587"/>
+            <wp:effectExtent l="0" t="0" r="5080" b="3810"/>
+            <wp:docPr id="239395453" name="Рисунок 1"/>
             <wp:cNvGraphicFramePr>
               <a:graphicFrameLocks xmlns:a="http://schemas.openxmlformats.org/drawingml/2006/main" noChangeAspect="1"/>
             </wp:cNvGraphicFramePr>
@@ -3815,11 +3804,17 @@
               <a:graphicData uri="http://schemas.openxmlformats.org/drawingml/2006/picture">
                 <pic:pic xmlns:pic="http://schemas.openxmlformats.org/drawingml/2006/picture">
                   <pic:nvPicPr>
-                    <pic:cNvPr id="1264360541" name=""/>
+                    <pic:cNvPr id="239395453" name="Рисунок 239395453"/>
                     <pic:cNvPicPr/>
                   </pic:nvPicPr>
                   <pic:blipFill>
-                    <a:blip r:embed="rId7"/>
+                    <a:blip r:embed="rId7">
+                      <a:extLst>
+                        <a:ext uri="{28A0092B-C50C-407E-A947-70E740481C1C}">
+                          <a14:useLocalDpi xmlns:a14="http://schemas.microsoft.com/office/drawing/2010/main" val="0"/>
+                        </a:ext>
+                      </a:extLst>
+                    </a:blip>
                     <a:stretch>
                       <a:fillRect/>
                     </a:stretch>
@@ -3827,7 +3822,7 @@
                   <pic:spPr>
                     <a:xfrm>
                       <a:off x="0" y="0"/>
-                      <a:ext cx="5556649" cy="3889773"/>
+                      <a:ext cx="5121810" cy="3809327"/>
                     </a:xfrm>
                     <a:prstGeom prst="rect">
                       <a:avLst/>
@@ -3846,11 +3841,12 @@
           <w:lang w:val="en-US"/>
         </w:rPr>
       </w:pPr>
+    </w:p>
+    <w:p>
       <w:r>
         <w:rPr>
           <w:lang w:val="en-US"/>
         </w:rPr>
-        <w:lastRenderedPageBreak/>
         <w:t>SCA:</w:t>
       </w:r>
     </w:p>
@@ -3862,13 +3858,14 @@
       </w:pPr>
       <w:r>
         <w:rPr>
+          <w:noProof/>
           <w:lang w:val="en-US"/>
         </w:rPr>
         <w:drawing>
-          <wp:inline distT="0" distB="0" distL="0" distR="0" wp14:anchorId="24B50BE9" wp14:editId="701CE23D">
-            <wp:extent cx="5575464" cy="2485534"/>
-            <wp:effectExtent l="0" t="0" r="0" b="3810"/>
-            <wp:docPr id="2115656621" name="Рисунок 1"/>
+          <wp:inline distT="0" distB="0" distL="0" distR="0">
+            <wp:extent cx="5939790" cy="2847975"/>
+            <wp:effectExtent l="0" t="0" r="3810" b="0"/>
+            <wp:docPr id="1689912341" name="Рисунок 2"/>
             <wp:cNvGraphicFramePr>
               <a:graphicFrameLocks xmlns:a="http://schemas.openxmlformats.org/drawingml/2006/main" noChangeAspect="1"/>
             </wp:cNvGraphicFramePr>
@@ -3876,11 +3873,17 @@
               <a:graphicData uri="http://schemas.openxmlformats.org/drawingml/2006/picture">
                 <pic:pic xmlns:pic="http://schemas.openxmlformats.org/drawingml/2006/picture">
                   <pic:nvPicPr>
-                    <pic:cNvPr id="2115656621" name=""/>
+                    <pic:cNvPr id="1689912341" name="Рисунок 1689912341"/>
                     <pic:cNvPicPr/>
                   </pic:nvPicPr>
                   <pic:blipFill>
-                    <a:blip r:embed="rId8"/>
+                    <a:blip r:embed="rId8" cstate="print">
+                      <a:extLst>
+                        <a:ext uri="{28A0092B-C50C-407E-A947-70E740481C1C}">
+                          <a14:useLocalDpi xmlns:a14="http://schemas.microsoft.com/office/drawing/2010/main" val="0"/>
+                        </a:ext>
+                      </a:extLst>
+                    </a:blip>
                     <a:stretch>
                       <a:fillRect/>
                     </a:stretch>
@@ -3888,7 +3891,7 @@
                   <pic:spPr>
                     <a:xfrm>
                       <a:off x="0" y="0"/>
-                      <a:ext cx="5586420" cy="2490418"/>
+                      <a:ext cx="5939790" cy="2847975"/>
                     </a:xfrm>
                     <a:prstGeom prst="rect">
                       <a:avLst/>
@@ -3901,12 +3904,36 @@
         </w:drawing>
       </w:r>
     </w:p>
-    <w:p>
-      <w:pPr>
+    <w:p/>
+    <w:p>
+      <w:r>
+        <w:t>Ссылка на последний запуск p</w:t>
+      </w:r>
+      <w:proofErr w:type="spellStart"/>
+      <w:r>
         <w:rPr>
           <w:lang w:val="en-US"/>
         </w:rPr>
-      </w:pPr>
+        <w:t>ipeline</w:t>
+      </w:r>
+      <w:proofErr w:type="spellEnd"/>
+      <w:r>
+        <w:t xml:space="preserve"> в</w:t>
+      </w:r>
+      <w:r>
+        <w:t xml:space="preserve"> репозитории: </w:t>
+      </w:r>
+      <w:hyperlink r:id="rId9" w:history="1">
+        <w:r>
+          <w:rPr>
+            <w:rStyle w:val="a3"/>
+          </w:rPr>
+          <w:t>https://github.com/2BuRy1/information_security_lab_1/actions/runs/35137409008/job/104933114454</w:t>
+        </w:r>
+      </w:hyperlink>
+      <w:r>
+        <w:t xml:space="preserve"> </w:t>
+      </w:r>
     </w:p>
     <w:sectPr>
       <w:pgSz w:w="11906" w:h="16838"/>
@@ -5307,7 +5334,7 @@
 </file>
 
 <file path=customXml/itemProps1.xml><?xml version="1.0" encoding="utf-8"?>
-<ds:datastoreItem xmlns:ds="http://schemas.openxmlformats.org/officeDocument/2006/customXml" ds:itemID="{D0B3242E-4C3B-0249-9C6C-9124F136A053}">
+<ds:datastoreItem xmlns:ds="http://schemas.openxmlformats.org/officeDocument/2006/customXml" ds:itemID="{7C93624E-ACFF-9E40-8F7D-56E9A877FCBF}">
   <ds:schemaRefs>
     <ds:schemaRef ds:uri="http://schemas.openxmlformats.org/officeDocument/2006/bibliography"/>
   </ds:schemaRefs>

</xml_diff>